<commit_message>
docs: M5 verification pass; design doc v2.1 (BADLAND art direction) + HANDOFF.md
M5 驗證：100 道具 pickup 全過（零例外、效果欄位皆有寫入）、10 組
Synergy 全觸發（含貓咪軍團跟班 ×1.5）、疊滿旗標實彈 150 幀無錯。
企畫書 Section 7 視覺原則改為 BADLAND 式、7.3 換為實際採用 prompt、
里程碑標記進度；新增 HANDOFF.md 供跨帳號交接。

Co-Authored-By: Claude Fable 5 <noreply@anthropic.com>
</commit_message>
<xml_diff>
--- a/黑貓流浪記_企畫書_v2.0_Roguelike.docx
+++ b/黑貓流浪記_企畫書_v2.0_Roguelike.docx
@@ -40,7 +40,7 @@
           <w:sz w:val="80"/>
           <w:szCs w:val="80"/>
         </w:rPr>
-        <w:t xml:space="preserve">遊戲企畫書 v2.0</w:t>
+        <w:t xml:space="preserve">遊戲企畫書 v2.1（美術方向改版：BADLAND 式）</w:t>
       </w:r>
     </w:p>
     <w:p>
@@ -32475,7 +32475,7 @@
           <w:sz w:val="22"/>
           <w:szCs w:val="22"/>
         </w:rPr>
-        <w:t xml:space="preserve">高對比剪影風格：純黑角色輪廓 × 灰白背景，每層有特定色調光源</w:t>
+        <w:t xml:space="preserve">BADLAND 式高對比：發光彩色背景 × 純黑前景剪影，每層有專屬發光色調；純黑只保留給可互動物（角色／敵人／Boss／地板牆面）</w:t>
       </w:r>
     </w:p>
     <w:p>
@@ -32532,7 +32532,7 @@
           <w:sz w:val="22"/>
           <w:szCs w:val="22"/>
         </w:rPr>
-        <w:t xml:space="preserve">每層背景有獨特剪影元素（屋頂磚、廚房廚具、暗巷路燈…）</w:t>
+        <w:t xml:space="preserve">背景整張明亮（含底部）、禁止純黑區域，角色站立區才不會與場景融合；子彈採亮核心＋3px 粗黑邊（亮背景靠黑邊讀、黑前景靠亮核心讀）</w:t>
       </w:r>
     </w:p>
     <w:p>
@@ -32557,7 +32557,7 @@
           <w:sz w:val="28"/>
           <w:szCs w:val="28"/>
         </w:rPr>
-        <w:t xml:space="preserve">▍ 7.2 Higgsfield Prompt 素材清單（P1 必需）</w:t>
+        <w:t xml:space="preserve">▍ 7.2 Higgsfield Prompt 素材清單（P1 必需）— ✅ 已完成：角色／Boss／敵人黑剪影沿用（白底純黑剪影配方＋去背管線 _tmp/imgproc）</w:t>
       </w:r>
     </w:p>
     <w:tbl>
@@ -33103,7 +33103,7 @@
           <w:sz w:val="28"/>
           <w:szCs w:val="28"/>
         </w:rPr>
-        <w:t xml:space="preserve">▍ 7.3 Higgsfield Prompt 素材清單（P2 重要）</w:t>
+        <w:t xml:space="preserve">▍ 7.3 Higgsfield Prompt 素材清單（P2 重要）— ✅ 已完成（v2.1 改版為 BADLAND 式發光彩色背景，以下為實際採用 Prompt）</w:t>
       </w:r>
     </w:p>
     <w:tbl>
@@ -33261,7 +33261,7 @@
                 <w:sz w:val="20"/>
                 <w:szCs w:val="20"/>
               </w:rPr>
-              <w:t xml:space="preserve">"LIMBO style rooftop panorama silhouette, city skyline, chimney stacks, pure black on bright sky, parallax game background, side scrolling"</w:t>
+              <w:t xml:space="preserve">"BADLAND style 2D game parallax background, vivid luminous painterly colors, glowing atmospheric light bloom, soft gradients, dreamy haze, background scenery only, no foreground objects, no pure black anywhere, bright glowing backdrop filling the whole frame including the bottom, side scrolling game art, city rooftop panorama at golden sunrise, warm amber and soft sky blue, distant chimney skyline as soft blue-grey midtone shapes glowing in morning haze"</w:t>
             </w:r>
           </w:p>
         </w:tc>
@@ -33333,7 +33333,7 @@
                 <w:sz w:val="20"/>
                 <w:szCs w:val="20"/>
               </w:rPr>
-              <w:t xml:space="preserve">"LIMBO style kitchen silhouette background, hanging pots and pans, tiled floor reflection, warm amber light, side scrolling game background"</w:t>
+              <w:t xml:space="preserve">"BADLAND style 2D game parallax background, vivid luminous painterly colors, glowing atmospheric light bloom, soft gradients, dreamy haze, background scenery only, no foreground objects, no pure black anywhere, bright glowing backdrop filling the whole frame including the bottom, side scrolling game art, cozy kitchen interior bathed in warm orange lamplight, hanging pots and pans as warm brown midtone shapes, glowing amber steam and soft golden light everywhere"</w:t>
             </w:r>
           </w:p>
         </w:tc>
@@ -33405,7 +33405,7 @@
                 <w:sz w:val="20"/>
                 <w:szCs w:val="20"/>
               </w:rPr>
-              <w:t xml:space="preserve">"LIMBO style dark alley silhouette, rain streaks, street lamp, brick walls, puddles on ground, high contrast, side scrolling game background"</w:t>
+              <w:t xml:space="preserve">"BADLAND style 2D game parallax background, vivid luminous painterly colors, glowing atmospheric light bloom, soft gradients, dreamy haze, background scenery only, no foreground objects, no pure black anywhere, bright glowing backdrop filling the whole frame including the bottom, side scrolling game art, rainy night alley glowing with cold teal and electric blue luminous mist, radiant street lamp halo, brick walls as deep blue midtone shapes, shimmering wet reflections"</w:t>
             </w:r>
           </w:p>
         </w:tc>
@@ -33477,7 +33477,7 @@
                 <w:sz w:val="20"/>
                 <w:szCs w:val="20"/>
               </w:rPr>
-              <w:t xml:space="preserve">"LIMBO style abandoned warehouse silhouette, conveyor belts, crates, rusty pipes, industrial, dark atmosphere, side scrolling game background"</w:t>
+              <w:t xml:space="preserve">"BADLAND style 2D game parallax background, vivid luminous painterly colors, glowing atmospheric light bloom, soft gradients, dreamy haze, background scenery only, no foreground objects, no pure black anywhere, bright glowing backdrop filling the whole frame including the bottom, side scrolling game art, abandoned warehouse interior glowing with rusty orange and ember red industrial haze, crates and pipes as warm brown midtone shapes, dusty glowing light shafts"</w:t>
             </w:r>
           </w:p>
         </w:tc>
@@ -33549,7 +33549,7 @@
                 <w:sz w:val="20"/>
                 <w:szCs w:val="20"/>
               </w:rPr>
-              <w:t xml:space="preserve">"LIMBO style library silhouette, towering bookshelves fading into darkness, candle light sources, gothic architecture, side scrolling game background"</w:t>
+              <w:t xml:space="preserve">"BADLAND style 2D game parallax background, vivid luminous painterly colors, glowing atmospheric light bloom, soft gradients, dreamy haze, background scenery only, no foreground objects, no pure black anywhere, bright glowing backdrop filling the whole frame including the bottom, side scrolling game art, vast gothic library hall glowing with golden candlelight haze, towering bookshelves as warm sepia midtone shapes fading into luminous amber mist"</w:t>
             </w:r>
           </w:p>
         </w:tc>
@@ -33621,7 +33621,7 @@
                 <w:sz w:val="20"/>
                 <w:szCs w:val="20"/>
               </w:rPr>
-              <w:t xml:space="preserve">"LIMBO style shrine garden silhouette, torii gates, stone lanterns, pine trees, moonlight, ethereal atmosphere, side scrolling game background"</w:t>
+              <w:t xml:space="preserve">"BADLAND style 2D game parallax background, vivid luminous painterly colors, glowing atmospheric light bloom, soft gradients, dreamy haze, background scenery only, no foreground objects, no pure black anywhere, bright glowing backdrop filling the whole frame including the bottom, side scrolling game art, shrine garden under luminous violet and cyan moonlight, torii gates and pine trees as deep indigo midtone shapes, ethereal glowing mist, radiant full moon halo"</w:t>
             </w:r>
           </w:p>
         </w:tc>
@@ -34744,7 +34744,7 @@
                 <w:sz w:val="20"/>
                 <w:szCs w:val="20"/>
               </w:rPr>
-              <w:t xml:space="preserve">幾何佔位版跑通</w:t>
+              <w:t xml:space="preserve">幾何佔位版跑通 ✅ 已完成</w:t>
             </w:r>
           </w:p>
         </w:tc>
@@ -34851,7 +34851,7 @@
                 <w:sz w:val="20"/>
                 <w:szCs w:val="20"/>
               </w:rPr>
-              <w:t xml:space="preserve">程序地圖生成</w:t>
+              <w:t xml:space="preserve">程序地圖生成 ✅ 已完成</w:t>
             </w:r>
           </w:p>
         </w:tc>
@@ -34958,7 +34958,7 @@
                 <w:sz w:val="20"/>
                 <w:szCs w:val="20"/>
               </w:rPr>
-              <w:t xml:space="preserve">美術素材整合</w:t>
+              <w:t xml:space="preserve">美術素材整合 ✅ 已完成</w:t>
             </w:r>
           </w:p>
         </w:tc>
@@ -35065,7 +35065,7 @@
                 <w:sz w:val="20"/>
                 <w:szCs w:val="20"/>
               </w:rPr>
-              <w:t xml:space="preserve">完整 6 層地圖</w:t>
+              <w:t xml:space="preserve">完整 6 層地圖 ✅ 已完成（含美術方向改版）</w:t>
             </w:r>
           </w:p>
         </w:tc>
@@ -35172,7 +35172,7 @@
                 <w:sz w:val="20"/>
                 <w:szCs w:val="20"/>
               </w:rPr>
-              <w:t xml:space="preserve">100 個道具+Synergy</w:t>
+              <w:t xml:space="preserve">100 個道具+Synergy ✅ 已完成（100 道具＋10 Synergy 全量驗證通過）</w:t>
             </w:r>
           </w:p>
         </w:tc>

</xml_diff>